<commit_message>
Add hsp65 alignment figure (Fig. 2) to article
Alignment of the GTDB complex genomes, species in the order kansasii,
persicum, pseudokansasii, innocens, attenuatum, ostraviense, gastri;
shows the Korean kansasii genomes as the exception. Figure sits on a
landscape page in the regenerated docx.

Co-Authored-By: Claude Sonnet 5.5 <noreply@anthropic.com>
</commit_message>
<xml_diff>
--- a/article/hsp65_differentiates_kansasii_complex.docx
+++ b/article/hsp65_differentiates_kansasii_complex.docx
@@ -2,7 +2,7 @@
 <file path=word/document.xml><?xml version="1.0" encoding="utf-8"?>
 <w:document xmlns:w="http://schemas.openxmlformats.org/wordprocessingml/2006/main" xmlns:m="http://schemas.openxmlformats.org/officeDocument/2006/math" xmlns:r="http://schemas.openxmlformats.org/officeDocument/2006/relationships" xmlns:o="urn:schemas-microsoft-com:office:office" xmlns:v="urn:schemas-microsoft-com:vml" xmlns:w10="urn:schemas-microsoft-com:office:word" xmlns:a="http://schemas.openxmlformats.org/drawingml/2006/main" xmlns:pic="http://schemas.openxmlformats.org/drawingml/2006/picture" xmlns:wp="http://schemas.openxmlformats.org/drawingml/2006/wordprocessingDrawing">
   <w:body>
-    <w:bookmarkStart w:id="34" w:name="X0bf1595398309c2c1bf8de1a2c7e5b882902519"/>
+    <w:bookmarkStart w:id="42" w:name="X0bf1595398309c2c1bf8de1a2c7e5b882902519"/>
     <w:p>
       <w:pPr>
         <w:pStyle w:val="Heading1"/>
@@ -73,7 +73,7 @@
           <w:i/>
           <w:iCs/>
         </w:rPr>
-        <w:t xml:space="preserve">output/mlsa/main1_locus_discovery*</w:t>
+        <w:t xml:space="preserve">output/mlsa/locus_discovery*</w:t>
       </w:r>
       <w:r>
         <w:rPr>
@@ -95,14 +95,29 @@
           <w:i/>
           <w:iCs/>
         </w:rPr>
-        <w:t xml:space="preserve">main4_hsp65_vs_wgs</w:t>
-      </w:r>
-      <w:r>
-        <w:rPr>
-          <w:i/>
-          <w:iCs/>
-        </w:rPr>
-        <w:t xml:space="preserve">). Authors and affiliations to be added.</w:t>
+        <w:t xml:space="preserve">sanger_vs_wgs</w:t>
+      </w:r>
+      <w:r>
+        <w:rPr>
+          <w:i/>
+          <w:iCs/>
+        </w:rPr>
+        <w:t xml:space="preserve">). Authors and affiliations to be added. Merged on 2026-10-19 with the earlier mlsa-kansasii draft (</w:t>
+      </w:r>
+      <w:r>
+        <w:rPr>
+          <w:rStyle w:val="VerbatimChar"/>
+          <w:i/>
+          <w:iCs/>
+        </w:rPr>
+        <w:t xml:space="preserve">hsp65_sanger_identification.md</w:t>
+      </w:r>
+      <w:r>
+        <w:rPr>
+          <w:i/>
+          <w:iCs/>
+        </w:rPr>
+        <w:t xml:space="preserve">, 2026-10-09); its routine-use material is section 5. Numbers in section 5.3 come from that earlier analysis (126 isolates) and have not been recomputed on the current cohort.</w:t>
       </w:r>
     </w:p>
     <w:bookmarkStart w:id="20" w:name="abstract"/>
@@ -269,7 +284,7 @@
         <w:t xml:space="preserve"> </w:t>
       </w:r>
       <w:r>
-        <w:t xml:space="preserve">hsp65 separated 21 of 21 species pairs once three near-clonal genomes carrying an atypical hsp65 were set aside (within-species divergence up to 0.45%, between-species at least 1.36%). A perfect read (hsp65 extracted from each assembly) gave the genome species for 177 of 177 uncontaminated isolates. Of 133 analysed isolates, 109 received a call and</w:t>
+        <w:t xml:space="preserve">hsp65 separated 21 of 21 species pairs once three near-clonal genomes carrying an atypical hsp65 were set aside (within-species divergence up to 0.45%, between-species at least 1.36%). A perfect read (hsp65 extracted from each assembly) gave the genome species for 174 of 174 uncontaminated isolates. Of 133 analysed isolates, 109 received a call and</w:t>
       </w:r>
       <w:r>
         <w:t xml:space="preserve"> </w:t>
@@ -412,7 +427,7 @@
         <w:t xml:space="preserve"> </w:t>
       </w:r>
       <w:r>
-        <w:t xml:space="preserve">Whole-genome species (GTDB-Tk, release 232 genomes as reference) of 180 clinical isolates sequenced on Illumina and assembled with Unicycler. CheckM contamination above the lab’s flag marks an isolate as contaminated (Mkan329-035, -106, -113); these are excluded because a mixed sample has no single species.</w:t>
+        <w:t xml:space="preserve">Whole-genome species (GTDB-Tk, release 232 genomes as reference) of 177 clinical isolates in the complex, sequenced on Illumina and assembled with Unicycler (the screening table holds 186 isolates; the 8 reference strains Mkan329-126 to -133 and one non-complex patient isolate are not counted). CheckM contamination above the lab’s flag marks an isolate as contaminated (Mkan329-035, -106, -113); these are excluded because a mixed sample has no single species.</w:t>
       </w:r>
     </w:p>
     <w:p>
@@ -737,7 +752,7 @@
         <w:pStyle w:val="BodyText"/>
       </w:pPr>
       <w:r>
-        <w:t xml:space="preserve">All four failing hsp65 pairs involve the same three near-clonal genomes (kansasii with gastri, ostraviense, persicum, pseudokansasii). Without them, the largest within-species distance is 0.45% and the smallest between-species distance 1.36% over 441 bp, a gap of about 4 nucleotides. With them, within-kansasii divergence is 2.5%, which swallows the gap. 16S, in contrast, fails for reasons that no genome choice removes: several species have identical 16S sequences.</w:t>
+        <w:t xml:space="preserve">All four failing hsp65 pairs involve the same three near-clonal genomes (kansasii with gastri, ostraviense, persicum, pseudokansasii). Figure 2 shows them in the hsp65 alignment. Without them, the largest within-species distance is 0.45% and the smallest between-species distance 1.36% over 441 bp, a gap of about 4 nucleotides. With them, within-kansasii divergence is 2.5%, which swallows the gap. 16S, in contrast, fails for reasons that no genome choice removes: several species have identical 16S sequences.</w:t>
       </w:r>
     </w:p>
     <w:bookmarkEnd w:id="23"/>
@@ -755,7 +770,7 @@
         <w:pStyle w:val="FirstParagraph"/>
       </w:pPr>
       <w:r>
-        <w:t xml:space="preserve">For all 177 uncontaminated isolates the in-silico amplicon had status ok and named the genome species (123 kansasii, 30 persicum, 20 pseudokansasii, 2 attenuatum, 1 innocens, 1 ostraviense). The amplicon was identical to its closest reference in 168 isolates, differed by one base in 4 and by two in 5. The closest other species was at least 4 differences further away (median 8).</w:t>
+        <w:t xml:space="preserve">For all 174 uncontaminated isolates the in-silico amplicon had status ok and named the genome species (122 kansasii, 29 persicum, 19 pseudokansasii, 2 attenuatum, 1 innocens, 1 ostraviense). The amplicon was identical to its closest reference in 165 isolates, differed by one base in 4 and by two in 5. The closest other species was at least 4 differences further away (median 8). In particular, all 122 uncontaminated kansasii isolates had kansasii as the closest species (121 identical to the reference, one with one difference), so none carries the persicum-like hsp65 of the Korean kansasii genomes (section 4).</w:t>
       </w:r>
     </w:p>
     <w:bookmarkEnd w:id="24"/>
@@ -1186,7 +1201,7 @@
     </w:p>
     <w:bookmarkEnd w:id="29"/>
     <w:bookmarkEnd w:id="30"/>
-    <w:bookmarkStart w:id="31" w:name="discussion"/>
+    <w:bookmarkStart w:id="34" w:name="discussion"/>
     <w:p>
       <w:pPr>
         <w:pStyle w:val="Heading2"/>
@@ -1251,13 +1266,18 @@
     <w:p>
       <w:pPr>
         <w:pStyle w:val="BodyText"/>
+        <w:sectPr>
+          <w:type w:val="nextPage"/>
+          <w:pgSz w:w="12240" w:h="15840"/>
+          <w:pgMar w:top="1080" w:right="1080" w:bottom="1080" w:left="1080" w:header="708" w:footer="708" w:gutter="0"/>
+        </w:sectPr>
       </w:pPr>
       <w:r>
         <w:rPr>
           <w:b/>
           <w:bCs/>
         </w:rPr>
-        <w:t xml:space="preserve">The atypical lineage is real and must be flagged, not ignored.</w:t>
+        <w:t xml:space="preserve">The atypical lineage is real but absent from our isolates.</w:t>
       </w:r>
       <w:r>
         <w:t xml:space="preserve"> </w:t>
@@ -1297,25 +1317,265 @@
         <w:t xml:space="preserve"> </w:t>
       </w:r>
       <w:r>
-        <w:t xml:space="preserve">of Jagielski et al.). An hsp65 read of such a strain would be called persicum. Our rules keep these genomes as references, which lets a read that matches them be reported as kansasii with an atypical-hsp65 note and sent for a second locus. None of the clinical reads behaved like this. We therefore claim that hsp65 differentiates the complex, with this caveat made operational, and not that it is infallible.</w:t>
+        <w:t xml:space="preserve">of Jagielski et al.). The alignment of the GTDB genomes (Figure 2, species in the order kansasii, persicum, pseudokansasii, innocens, attenuatum, ostraviense, gastri) shows that the Korean samples are the exception: every other genome groups with its species, whereas these three kansasii genomes differ from the other kansasii and follow the persicum pattern. The Korean amplicon is 1 to 3 differences from the persicum genomes, overlapping the 0 to 2 differences seen among persicum genomes themselves, so an hsp65 read of such a strain would be called persicum and the margin rule cannot separate the two; gyrA does. None of our isolates behaved like this. Among the 122 uncontaminated isolates that are</w:t>
+      </w:r>
+      <w:r>
+        <w:t xml:space="preserve"> </w:t>
+      </w:r>
+      <w:r>
+        <w:rPr>
+          <w:i/>
+          <w:iCs/>
+        </w:rPr>
+        <w:t xml:space="preserve">M. kansasii</w:t>
+      </w:r>
+      <w:r>
+        <w:t xml:space="preserve"> </w:t>
+      </w:r>
+      <w:r>
+        <w:t xml:space="preserve">by genome, the in-silico amplicon had kansasii as the closest species in all 122, identical to the kansasii reference in 121 and one base away in the other, so none is persicum-like. Laying the Korean amplicon directly over each assembly (</w:t>
+      </w:r>
+      <w:r>
+        <w:rPr>
+          <w:rStyle w:val="VerbatimChar"/>
+        </w:rPr>
+        <w:t xml:space="preserve">04_korean_type_check.py</w:t>
+      </w:r>
+      <w:r>
+        <w:t xml:space="preserve">) confirms it: the closest kansasii isolate is 10 differences away, and none of the 122 is closer to the Korean amplicon than to the kansasii reference. This covers the whole cohort, not only the 109 isolates with a callable Sanger read. We therefore claim that hsp65 differentiates the complex, and not that it is infallible.</w:t>
+      </w:r>
+    </w:p>
+    <w:p>
+      <w:pPr>
+        <w:pStyle w:val="CaptionedFigure"/>
+      </w:pPr>
+      <w:r>
+        <w:drawing>
+          <wp:inline>
+            <wp:extent cx="8595360" cy="4111851"/>
+            <wp:effectExtent b="0" l="0" r="0" t="0"/>
+            <wp:docPr descr="hsp65 alignment of the GTDB genomes of the complex" title="" id="32" name="Picture"/>
+            <a:graphic>
+              <a:graphicData uri="http://schemas.openxmlformats.org/drawingml/2006/picture">
+                <pic:pic>
+                  <pic:nvPicPr>
+                    <pic:cNvPr descr="figures/hsp65_alignment_divider.png" id="33" name="Picture"/>
+                    <pic:cNvPicPr>
+                      <a:picLocks noChangeArrowheads="1" noChangeAspect="1"/>
+                    </pic:cNvPicPr>
+                  </pic:nvPicPr>
+                  <pic:blipFill>
+                    <a:blip r:embed="rId31"/>
+                    <a:stretch>
+                      <a:fillRect/>
+                    </a:stretch>
+                  </pic:blipFill>
+                  <pic:spPr bwMode="auto">
+                    <a:xfrm>
+                      <a:off x="0" y="0"/>
+                      <a:ext cx="8595360" cy="4111851"/>
+                    </a:xfrm>
+                    <a:prstGeom prst="rect">
+                      <a:avLst/>
+                    </a:prstGeom>
+                    <a:noFill/>
+                    <a:ln w="9525">
+                      <a:noFill/>
+                      <a:headEnd/>
+                      <a:tailEnd/>
+                    </a:ln>
+                  </pic:spPr>
+                </pic:pic>
+              </a:graphicData>
+            </a:graphic>
+          </wp:inline>
+        </w:drawing>
+      </w:r>
+    </w:p>
+    <w:p>
+      <w:pPr>
+        <w:pStyle w:val="ImageCaption"/>
+      </w:pPr>
+      <w:r>
+        <w:t xml:space="preserve">hsp65 alignment of the GTDB genomes of the complex</w:t>
       </w:r>
     </w:p>
     <w:p>
       <w:pPr>
         <w:pStyle w:val="BodyText"/>
+        <w:sectPr>
+          <w:type w:val="nextPage"/>
+          <w:pgSz w:w="15840" w:h="12240" w:orient="landscape"/>
+          <w:pgMar w:top="1080" w:right="1080" w:bottom="1080" w:left="1080" w:header="708" w:footer="708" w:gutter="0"/>
+        </w:sectPr>
       </w:pPr>
       <w:r>
         <w:rPr>
           <w:b/>
           <w:bCs/>
         </w:rPr>
-        <w:t xml:space="preserve">A second locus is a confirmation step, not a replacement.</w:t>
-      </w:r>
-      <w:r>
-        <w:t xml:space="preserve"> </w:t>
-      </w:r>
-      <w:r>
-        <w:t xml:space="preserve">gyrA, gyrB, rpoB, recA and tuf each separate all 21 pairs and would be better markers if one had to choose from scratch. The point is that hsp65 is already sequenced routinely, has a large reference base, and reaches the same answer on every isolate where a usable read exists. Adding gyrA is appropriate when the read hits the atypical lineage, the margin is below two, or the result must be certain for reporting.</w:t>
+        <w:t xml:space="preserve">Figure 2.</w:t>
+      </w:r>
+      <w:r>
+        <w:t xml:space="preserve"> </w:t>
+      </w:r>
+      <w:r>
+        <w:t xml:space="preserve">Alignment of the hsp65 amplicon of the GTDB genomes of the</w:t>
+      </w:r>
+      <w:r>
+        <w:t xml:space="preserve"> </w:t>
+      </w:r>
+      <w:r>
+        <w:rPr>
+          <w:i/>
+          <w:iCs/>
+        </w:rPr>
+        <w:t xml:space="preserve">M. kansasii</w:t>
+      </w:r>
+      <w:r>
+        <w:t xml:space="preserve"> </w:t>
+      </w:r>
+      <w:r>
+        <w:t xml:space="preserve">complex. Black lines separate the species, from top to bottom</w:t>
+      </w:r>
+      <w:r>
+        <w:t xml:space="preserve"> </w:t>
+      </w:r>
+      <w:r>
+        <w:rPr>
+          <w:i/>
+          <w:iCs/>
+        </w:rPr>
+        <w:t xml:space="preserve">kansasii</w:t>
+      </w:r>
+      <w:r>
+        <w:t xml:space="preserve">,</w:t>
+      </w:r>
+      <w:r>
+        <w:t xml:space="preserve"> </w:t>
+      </w:r>
+      <w:r>
+        <w:rPr>
+          <w:i/>
+          <w:iCs/>
+        </w:rPr>
+        <w:t xml:space="preserve">persicum</w:t>
+      </w:r>
+      <w:r>
+        <w:t xml:space="preserve">,</w:t>
+      </w:r>
+      <w:r>
+        <w:t xml:space="preserve"> </w:t>
+      </w:r>
+      <w:r>
+        <w:rPr>
+          <w:i/>
+          <w:iCs/>
+        </w:rPr>
+        <w:t xml:space="preserve">pseudokansasii</w:t>
+      </w:r>
+      <w:r>
+        <w:t xml:space="preserve">,</w:t>
+      </w:r>
+      <w:r>
+        <w:t xml:space="preserve"> </w:t>
+      </w:r>
+      <w:r>
+        <w:rPr>
+          <w:i/>
+          <w:iCs/>
+        </w:rPr>
+        <w:t xml:space="preserve">innocens</w:t>
+      </w:r>
+      <w:r>
+        <w:t xml:space="preserve">,</w:t>
+      </w:r>
+      <w:r>
+        <w:t xml:space="preserve"> </w:t>
+      </w:r>
+      <w:r>
+        <w:rPr>
+          <w:i/>
+          <w:iCs/>
+        </w:rPr>
+        <w:t xml:space="preserve">attenuatum</w:t>
+      </w:r>
+      <w:r>
+        <w:t xml:space="preserve">,</w:t>
+      </w:r>
+      <w:r>
+        <w:t xml:space="preserve"> </w:t>
+      </w:r>
+      <w:r>
+        <w:rPr>
+          <w:i/>
+          <w:iCs/>
+        </w:rPr>
+        <w:t xml:space="preserve">ostraviense</w:t>
+      </w:r>
+      <w:r>
+        <w:t xml:space="preserve"> </w:t>
+      </w:r>
+      <w:r>
+        <w:t xml:space="preserve">and</w:t>
+      </w:r>
+      <w:r>
+        <w:t xml:space="preserve"> </w:t>
+      </w:r>
+      <w:r>
+        <w:rPr>
+          <w:i/>
+          <w:iCs/>
+        </w:rPr>
+        <w:t xml:space="preserve">gastri</w:t>
+      </w:r>
+      <w:r>
+        <w:t xml:space="preserve">. The three highlighted</w:t>
+      </w:r>
+      <w:r>
+        <w:t xml:space="preserve"> </w:t>
+      </w:r>
+      <w:r>
+        <w:rPr>
+          <w:i/>
+          <w:iCs/>
+        </w:rPr>
+        <w:t xml:space="preserve">kansasii</w:t>
+      </w:r>
+      <w:r>
+        <w:t xml:space="preserve"> </w:t>
+      </w:r>
+      <w:r>
+        <w:t xml:space="preserve">rows are the Korean genomes (GCF_002705785.1, GCF_002705825.1, GCF_002705865.1); they differ from the other</w:t>
+      </w:r>
+      <w:r>
+        <w:t xml:space="preserve"> </w:t>
+      </w:r>
+      <w:r>
+        <w:rPr>
+          <w:i/>
+          <w:iCs/>
+        </w:rPr>
+        <w:t xml:space="preserve">kansasii</w:t>
+      </w:r>
+      <w:r>
+        <w:t xml:space="preserve"> </w:t>
+      </w:r>
+      <w:r>
+        <w:t xml:space="preserve">genomes and carry the</w:t>
+      </w:r>
+      <w:r>
+        <w:t xml:space="preserve"> </w:t>
+      </w:r>
+      <w:r>
+        <w:rPr>
+          <w:i/>
+          <w:iCs/>
+        </w:rPr>
+        <w:t xml:space="preserve">persicum</w:t>
+      </w:r>
+      <w:r>
+        <w:t xml:space="preserve">-like pattern, so they are the exception.</w:t>
       </w:r>
     </w:p>
     <w:p>
@@ -1327,29 +1587,13 @@
           <w:b/>
           <w:bCs/>
         </w:rPr>
-        <w:t xml:space="preserve">Mixed cultures and contaminant reads are visible.</w:t>
-      </w:r>
-      <w:r>
-        <w:t xml:space="preserve"> </w:t>
-      </w:r>
-      <w:r>
-        <w:t xml:space="preserve">The one discordant isolate in the data, Mkan329-035, is a mixed culture (kansasii and ostraviense, CheckM 113%); hsp65 correctly reported the dominant ostraviense component. Mixed templates can show as secondary peaks in the trace, and the</w:t>
-      </w:r>
-      <w:r>
-        <w:t xml:space="preserve"> </w:t>
-      </w:r>
-      <w:r>
-        <w:rPr>
-          <w:i/>
-          <w:iCs/>
-        </w:rPr>
-        <w:t xml:space="preserve">Rothia</w:t>
-      </w:r>
-      <w:r>
-        <w:t xml:space="preserve"> </w:t>
-      </w:r>
-      <w:r>
-        <w:t xml:space="preserve">reads were rejected by the identity rule.</w:t>
+        <w:t xml:space="preserve">A second locus is a confirmation step, not a replacement.</w:t>
+      </w:r>
+      <w:r>
+        <w:t xml:space="preserve"> </w:t>
+      </w:r>
+      <w:r>
+        <w:t xml:space="preserve">gyrA, gyrB, rpoB, recA and tuf each separate all 21 pairs and would be better markers if one had to choose from scratch. The point is that hsp65 is already sequenced routinely, has a large reference base, and reaches the same answer on every isolate where a usable read exists. Adding gyrA is appropriate when the read hits the atypical lineage, the margin is below two, or the result must be certain for reporting.</w:t>
       </w:r>
     </w:p>
     <w:p>
@@ -1361,6 +1605,40 @@
           <w:b/>
           <w:bCs/>
         </w:rPr>
+        <w:t xml:space="preserve">Mixed cultures and contaminant reads are visible.</w:t>
+      </w:r>
+      <w:r>
+        <w:t xml:space="preserve"> </w:t>
+      </w:r>
+      <w:r>
+        <w:t xml:space="preserve">The one discordant isolate in the data, Mkan329-035, is a mixed culture (kansasii and ostraviense, CheckM 113%); hsp65 correctly reported the dominant ostraviense component. Mixed templates can show as secondary peaks in the trace, and the</w:t>
+      </w:r>
+      <w:r>
+        <w:t xml:space="preserve"> </w:t>
+      </w:r>
+      <w:r>
+        <w:rPr>
+          <w:i/>
+          <w:iCs/>
+        </w:rPr>
+        <w:t xml:space="preserve">Rothia</w:t>
+      </w:r>
+      <w:r>
+        <w:t xml:space="preserve"> </w:t>
+      </w:r>
+      <w:r>
+        <w:t xml:space="preserve">reads were rejected by the identity rule.</w:t>
+      </w:r>
+    </w:p>
+    <w:p>
+      <w:pPr>
+        <w:pStyle w:val="BodyText"/>
+      </w:pPr>
+      <w:r>
+        <w:rPr>
+          <w:b/>
+          <w:bCs/>
+        </w:rPr>
         <w:t xml:space="preserve">Limits.</w:t>
       </w:r>
       <w:r>
@@ -1391,6 +1669,12 @@
         <w:t xml:space="preserve"> </w:t>
       </w:r>
       <w:r>
+        <w:t xml:space="preserve">- The absence of the persicum-like kansasii hsp65 holds for this one-laboratory cohort; the three Korean genomes come from a single study, and the lineage may be present elsewhere.</w:t>
+      </w:r>
+      <w:r>
+        <w:t xml:space="preserve"> </w:t>
+      </w:r>
+      <w:r>
         <w:t xml:space="preserve">- Only two</w:t>
       </w:r>
       <w:r>
@@ -1410,48 +1694,23 @@
         <w:t xml:space="preserve">reads were BLASTed; the others were assigned by their identity to those.</w:t>
       </w:r>
     </w:p>
-    <w:bookmarkEnd w:id="31"/>
-    <w:bookmarkStart w:id="32" w:name="conclusion"/>
+    <w:bookmarkEnd w:id="34"/>
+    <w:bookmarkStart w:id="38" w:name="use-in-the-routine-laboratory"/>
     <w:p>
       <w:pPr>
         <w:pStyle w:val="Heading2"/>
       </w:pPr>
       <w:r>
-        <w:t xml:space="preserve">5. Conclusion</w:t>
-      </w:r>
-    </w:p>
-    <w:p>
-      <w:pPr>
-        <w:pStyle w:val="FirstParagraph"/>
-      </w:pPr>
-      <w:r>
-        <w:t xml:space="preserve">For the</w:t>
-      </w:r>
-      <w:r>
-        <w:t xml:space="preserve"> </w:t>
-      </w:r>
-      <w:r>
-        <w:rPr>
-          <w:i/>
-          <w:iCs/>
-        </w:rPr>
-        <w:t xml:space="preserve">M. kansasii</w:t>
-      </w:r>
-      <w:r>
-        <w:t xml:space="preserve"> </w:t>
-      </w:r>
-      <w:r>
-        <w:t xml:space="preserve">complex, a single good hsp65 Sanger read, aligned to one reference genome per species and called by best match with a margin, gave the genome species for all 109 isolates that produced a callable read and for all 177 perfect in-silico amplicons. The marker fails only through a defined atypical lineage, which the same alignment can flag. The failures in practice were absent or contaminated reads, which the rules reject. Hsp65 sequencing is sufficient for routine species identification in this complex, with gyrA as the confirmation locus for the flagged cases.</w:t>
-      </w:r>
-    </w:p>
-    <w:bookmarkEnd w:id="32"/>
-    <w:bookmarkStart w:id="33" w:name="references"/>
-    <w:p>
-      <w:pPr>
-        <w:pStyle w:val="Heading2"/>
-      </w:pPr>
-      <w:r>
-        <w:t xml:space="preserve">References</w:t>
+        <w:t xml:space="preserve">5. Use in the routine laboratory</w:t>
+      </w:r>
+    </w:p>
+    <w:bookmarkStart w:id="35" w:name="recommendations"/>
+    <w:p>
+      <w:pPr>
+        <w:pStyle w:val="Heading3"/>
+      </w:pPr>
+      <w:r>
+        <w:t xml:space="preserve">5.1 Recommendations</w:t>
       </w:r>
     </w:p>
     <w:p>
@@ -1463,7 +1722,17 @@
         </w:numPr>
       </w:pPr>
       <w:r>
-        <w:t xml:space="preserve">Alcaide F, et al. J Clin Microbiol 1997;35:1959-1964. doi:10.1128/jcm.35.8.1959-1964.1997</w:t>
+        <w:rPr>
+          <w:b/>
+          <w:bCs/>
+        </w:rPr>
+        <w:t xml:space="preserve">Keep hsp65 as the routine test and stop adding 16S</w:t>
+      </w:r>
+      <w:r>
+        <w:t xml:space="preserve"> </w:t>
+      </w:r>
+      <w:r>
+        <w:t xml:space="preserve">for this question. 16S ties between several complex species (12 of 21 species pairs resolved, against 17 for hsp65 and 21 for gyrA among 72 reference genomes) and adds no information.</w:t>
       </w:r>
     </w:p>
     <w:p>
@@ -1475,23 +1744,17 @@
         </w:numPr>
       </w:pPr>
       <w:r>
-        <w:t xml:space="preserve">Jagielski T, et al. Genomic insights into the</w:t>
-      </w:r>
-      <w:r>
-        <w:t xml:space="preserve"> </w:t>
-      </w:r>
-      <w:r>
-        <w:rPr>
-          <w:i/>
-          <w:iCs/>
-        </w:rPr>
-        <w:t xml:space="preserve">Mycobacterium kansasii</w:t>
-      </w:r>
-      <w:r>
-        <w:t xml:space="preserve"> </w:t>
-      </w:r>
-      <w:r>
-        <w:t xml:space="preserve">complex: an update. Front Microbiol 2019;10:2918. doi:10.3389/fmicb.2019.02918</w:t>
+        <w:rPr>
+          <w:b/>
+          <w:bCs/>
+        </w:rPr>
+        <w:t xml:space="preserve">Add gyrA only for defined cases:</w:t>
+      </w:r>
+      <w:r>
+        <w:t xml:space="preserve"> </w:t>
+      </w:r>
+      <w:r>
+        <w:t xml:space="preserve">the read matches the atypical-hsp65 kansasii genomes, two species are not clearly separated (margin below 2), or an isolate needs certainty for reporting. gyrA separates all 21 species pairs and was the recommended extra locus for 30 of 31 isolates still ambiguous under hsp65 plus 16S.</w:t>
       </w:r>
     </w:p>
     <w:p>
@@ -1503,7 +1766,17 @@
         </w:numPr>
       </w:pPr>
       <w:r>
-        <w:t xml:space="preserve">Kim H, et al. Int J Syst Evol Microbiol 2005;55:1649-1656. doi:10.1099/ijs.0.63553-0</w:t>
+        <w:rPr>
+          <w:b/>
+          <w:bCs/>
+        </w:rPr>
+        <w:t xml:space="preserve">Treat mixed cultures as a QC flag, not a species.</w:t>
+      </w:r>
+      <w:r>
+        <w:t xml:space="preserve"> </w:t>
+      </w:r>
+      <w:r>
+        <w:t xml:space="preserve">A high share of secondary peaks should trigger a repeat from a pure colony.</w:t>
       </w:r>
     </w:p>
     <w:p>
@@ -1515,19 +1788,565 @@
         </w:numPr>
       </w:pPr>
       <w:r>
-        <w:t xml:space="preserve">McNabb A, et al. J Clin Microbiol 2004;42:3000-3011. doi:10.1128/JCM.42.7.3000-3011.2004</w:t>
-      </w:r>
-    </w:p>
+        <w:rPr>
+          <w:b/>
+          <w:bCs/>
+        </w:rPr>
+        <w:t xml:space="preserve">Repeat the PCR for no-call isolates</w:t>
+      </w:r>
+      <w:r>
+        <w:t xml:space="preserve"> </w:t>
+      </w:r>
+      <w:r>
+        <w:t xml:space="preserve">(about one in six, section 3.4); for the</w:t>
+      </w:r>
+      <w:r>
+        <w:t xml:space="preserve"> </w:t>
+      </w:r>
+      <w:r>
+        <w:rPr>
+          <w:i/>
+          <w:iCs/>
+        </w:rPr>
+        <w:t xml:space="preserve">Rothia</w:t>
+      </w:r>
+      <w:r>
+        <w:t xml:space="preserve"> </w:t>
+      </w:r>
+      <w:r>
+        <w:t xml:space="preserve">reads use a mycobacteria-specific primer pair or a fresh subculture.</w:t>
+      </w:r>
+    </w:p>
+    <w:bookmarkEnd w:id="35"/>
+    <w:bookmarkStart w:id="36" w:name="automation-with-sanger-microsynth"/>
+    <w:p>
+      <w:pPr>
+        <w:pStyle w:val="Heading3"/>
+      </w:pPr>
+      <w:r>
+        <w:t xml:space="preserve">5.2 Automation with sanger-microsynth</w:t>
+      </w:r>
+    </w:p>
+    <w:p>
+      <w:pPr>
+        <w:pStyle w:val="FirstParagraph"/>
+      </w:pPr>
+      <w:r>
+        <w:t xml:space="preserve">The</w:t>
+      </w:r>
+      <w:r>
+        <w:t xml:space="preserve"> </w:t>
+      </w:r>
+      <w:r>
+        <w:rPr>
+          <w:rStyle w:val="VerbatimChar"/>
+        </w:rPr>
+        <w:t xml:space="preserve">sanger-microsynth</w:t>
+      </w:r>
+      <w:r>
+        <w:t xml:space="preserve"> </w:t>
+      </w:r>
+      <w:r>
+        <w:t xml:space="preserve">repo reads Microsynth result mails (IMAP, read-only), unzips</w:t>
+      </w:r>
+      <w:r>
+        <w:t xml:space="preserve"> </w:t>
+      </w:r>
+      <w:r>
+        <w:rPr>
+          <w:rStyle w:val="VerbatimChar"/>
+        </w:rPr>
+        <w:t xml:space="preserve">.ab1</w:t>
+      </w:r>
+      <w:r>
+        <w:t xml:space="preserve">/FASTA, Mott-trims, BLASTs against NCBI, aligns each read to the references and emails a PDF with a sample table and one alignment PDF per read. The rules (</w:t>
+      </w:r>
+      <w:r>
+        <w:rPr>
+          <w:rStyle w:val="VerbatimChar"/>
+        </w:rPr>
+        <w:t xml:space="preserve">sanger_ms/call.py</w:t>
+      </w:r>
+      <w:r>
+        <w:t xml:space="preserve">) are the same as in Methods, plus:</w:t>
+      </w:r>
+    </w:p>
+    <w:tbl>
+      <w:tblPr>
+        <w:tblStyle w:val="Table"/>
+        <w:tblW w:type="pct" w:w="5000"/>
+        <w:tblLayout w:type="fixed"/>
+        <w:tblLook w:firstRow="1" w:lastRow="0" w:firstColumn="0" w:lastColumn="0" w:noHBand="0" w:noVBand="0" w:val="0020"/>
+      </w:tblPr>
+      <w:tblGrid>
+        <w:gridCol w:w="3960"/>
+        <w:gridCol w:w="3960"/>
+      </w:tblGrid>
+      <w:tr>
+        <w:trPr>
+          <w:tblHeader w:val="on"/>
+        </w:trPr>
+        <w:tc>
+          <w:tcPr/>
+          <w:p>
+            <w:pPr>
+              <w:pStyle w:val="Compact"/>
+              <w:jc w:val="left"/>
+            </w:pPr>
+            <w:r>
+              <w:t xml:space="preserve">Situation</w:t>
+            </w:r>
+          </w:p>
+        </w:tc>
+        <w:tc>
+          <w:tcPr/>
+          <w:p>
+            <w:pPr>
+              <w:pStyle w:val="Compact"/>
+              <w:jc w:val="left"/>
+            </w:pPr>
+            <w:r>
+              <w:t xml:space="preserve">Action</w:t>
+            </w:r>
+          </w:p>
+        </w:tc>
+      </w:tr>
+      <w:tr>
+        <w:tc>
+          <w:tcPr/>
+          <w:p>
+            <w:pPr>
+              <w:pStyle w:val="Compact"/>
+              <w:jc w:val="left"/>
+            </w:pPr>
+            <w:r>
+              <w:t xml:space="preserve">at least 98% identity, at least 2 differences ahead of the closest other species, mixed peaks below 10%, read of at least 200 bp</w:t>
+            </w:r>
+          </w:p>
+        </w:tc>
+        <w:tc>
+          <w:tcPr/>
+          <w:p>
+            <w:pPr>
+              <w:pStyle w:val="Compact"/>
+              <w:jc w:val="left"/>
+            </w:pPr>
+            <w:r>
+              <w:t xml:space="preserve">report species</w:t>
+            </w:r>
+          </w:p>
+        </w:tc>
+      </w:tr>
+      <w:tr>
+        <w:tc>
+          <w:tcPr/>
+          <w:p>
+            <w:pPr>
+              <w:pStyle w:val="Compact"/>
+              <w:jc w:val="left"/>
+            </w:pPr>
+            <w:r>
+              <w:t xml:space="preserve">closest = atypical-hsp65 kansasii genome, or species not separated</w:t>
+            </w:r>
+          </w:p>
+        </w:tc>
+        <w:tc>
+          <w:tcPr/>
+          <w:p>
+            <w:pPr>
+              <w:pStyle w:val="Compact"/>
+              <w:jc w:val="left"/>
+            </w:pPr>
+            <w:r>
+              <w:t xml:space="preserve">confirm with gyrA</w:t>
+            </w:r>
+          </w:p>
+        </w:tc>
+      </w:tr>
+      <w:tr>
+        <w:tc>
+          <w:tcPr/>
+          <w:p>
+            <w:pPr>
+              <w:pStyle w:val="Compact"/>
+              <w:jc w:val="left"/>
+            </w:pPr>
+            <w:r>
+              <w:t xml:space="preserve">no reference at least 98% identical, or read below 200 bp</w:t>
+            </w:r>
+          </w:p>
+        </w:tc>
+        <w:tc>
+          <w:tcPr/>
+          <w:p>
+            <w:pPr>
+              <w:pStyle w:val="Compact"/>
+              <w:jc w:val="left"/>
+            </w:pPr>
+            <w:r>
+              <w:t xml:space="preserve">repeat sequencing</w:t>
+            </w:r>
+          </w:p>
+        </w:tc>
+      </w:tr>
+      <w:tr>
+        <w:tc>
+          <w:tcPr/>
+          <w:p>
+            <w:pPr>
+              <w:pStyle w:val="Compact"/>
+              <w:jc w:val="left"/>
+            </w:pPr>
+            <w:r>
+              <w:t xml:space="preserve">at least 10% of base calls with a secondary peak</w:t>
+            </w:r>
+          </w:p>
+        </w:tc>
+        <w:tc>
+          <w:tcPr/>
+          <w:p>
+            <w:pPr>
+              <w:pStyle w:val="Compact"/>
+              <w:jc w:val="left"/>
+            </w:pPr>
+            <w:r>
+              <w:t xml:space="preserve">possible mixed culture, repeat from pure colony</w:t>
+            </w:r>
+          </w:p>
+        </w:tc>
+      </w:tr>
+      <w:tr>
+        <w:tc>
+          <w:tcPr/>
+          <w:p>
+            <w:pPr>
+              <w:pStyle w:val="Compact"/>
+              <w:jc w:val="left"/>
+            </w:pPr>
+            <w:r>
+              <w:t xml:space="preserve">16S read</w:t>
+            </w:r>
+          </w:p>
+        </w:tc>
+        <w:tc>
+          <w:tcPr/>
+          <w:p>
+            <w:pPr>
+              <w:pStyle w:val="Compact"/>
+              <w:jc w:val="left"/>
+            </w:pPr>
+            <w:r>
+              <w:t xml:space="preserve">not species-informative for this complex</w:t>
+            </w:r>
+          </w:p>
+        </w:tc>
+      </w:tr>
+    </w:tbl>
+    <w:p>
+      <w:pPr>
+        <w:pStyle w:val="BodyText"/>
+      </w:pPr>
+      <w:r>
+        <w:t xml:space="preserve">Forward and reverse reads (TB-11 / TB-12w) are paired by sample number and locus. Each read is called on its own and the sample call requires all usable reads to agree; otherwise the sample is reported as</w:t>
+      </w:r>
+      <w:r>
+        <w:t xml:space="preserve"> </w:t>
+      </w:r>
+      <w:r>
+        <w:t xml:space="preserve">“</w:t>
+      </w:r>
+      <w:r>
+        <w:t xml:space="preserve">repeat, reads disagree</w:t>
+      </w:r>
+      <w:r>
+        <w:t xml:space="preserve">”</w:t>
+      </w:r>
+      <w:r>
+        <w:t xml:space="preserve">. In the lab archive (183 forward, 64 reverse reads at the time) 51 samples had both reads, 37 had a call on both, and none disagreed, so no consensus sequence is built. Each read covers about 85% of the amplicon. hsp65 reads are aligned to the amplicons of all 72 genomes; the alignment PDF shows only the 7 reference strains plus the Korean genome if it is the closest hit.</w:t>
+      </w:r>
+    </w:p>
+    <w:bookmarkEnd w:id="36"/>
+    <w:bookmarkStart w:id="37" w:name="Xa209dcf59b21ce2fd8d9ae54b8c6c64bff691ad"/>
+    <w:p>
+      <w:pPr>
+        <w:pStyle w:val="Heading3"/>
+      </w:pPr>
+      <w:r>
+        <w:t xml:space="preserve">5.3 Earlier analysis on 126 isolates (2026-10-09)</w:t>
+      </w:r>
+    </w:p>
+    <w:p>
+      <w:pPr>
+        <w:pStyle w:val="FirstParagraph"/>
+      </w:pPr>
+      <w:r>
+        <w:t xml:space="preserve">Before the resequenced isolates were added, the same questions were run on 126 genome-typed isolates, 92 with a routine hsp65 read (mlsa-kansasii</w:t>
+      </w:r>
+      <w:r>
+        <w:t xml:space="preserve"> </w:t>
+      </w:r>
+      <w:r>
+        <w:rPr>
+          <w:rStyle w:val="VerbatimChar"/>
+        </w:rPr>
+        <w:t xml:space="preserve">locus_discovery</w:t>
+      </w:r>
+      <w:r>
+        <w:t xml:space="preserve"> </w:t>
+      </w:r>
+      <w:r>
+        <w:t xml:space="preserve">to</w:t>
+      </w:r>
+      <w:r>
+        <w:t xml:space="preserve"> </w:t>
+      </w:r>
+      <w:r>
+        <w:rPr>
+          <w:rStyle w:val="VerbatimChar"/>
+        </w:rPr>
+        <w:t xml:space="preserve">sanger_vs_wgs</w:t>
+      </w:r>
+      <w:r>
+        <w:t xml:space="preserve">, formerly main1 to main4). Not recomputed; shown because it adds two points the current analysis does not cover.</w:t>
+      </w:r>
+    </w:p>
+    <w:tbl>
+      <w:tblPr>
+        <w:tblStyle w:val="Table"/>
+        <w:tblW w:type="pct" w:w="5000"/>
+        <w:tblLayout w:type="fixed"/>
+        <w:tblLook w:firstRow="1" w:lastRow="0" w:firstColumn="0" w:lastColumn="0" w:noHBand="0" w:noVBand="0" w:val="0020"/>
+      </w:tblPr>
+      <w:tblGrid>
+        <w:gridCol w:w="1980"/>
+        <w:gridCol w:w="1980"/>
+        <w:gridCol w:w="1980"/>
+        <w:gridCol w:w="1980"/>
+      </w:tblGrid>
+      <w:tr>
+        <w:trPr>
+          <w:tblHeader w:val="on"/>
+        </w:trPr>
+        <w:tc>
+          <w:tcPr/>
+          <w:p>
+            <w:pPr>
+              <w:pStyle w:val="Compact"/>
+              <w:jc w:val="left"/>
+            </w:pPr>
+            <w:r>
+              <w:t xml:space="preserve">Method (92 isolates with a read)</w:t>
+            </w:r>
+          </w:p>
+        </w:tc>
+        <w:tc>
+          <w:tcPr/>
+          <w:p>
+            <w:pPr>
+              <w:pStyle w:val="Compact"/>
+              <w:jc w:val="left"/>
+            </w:pPr>
+            <w:r>
+              <w:t xml:space="preserve">Called</w:t>
+            </w:r>
+          </w:p>
+        </w:tc>
+        <w:tc>
+          <w:tcPr/>
+          <w:p>
+            <w:pPr>
+              <w:pStyle w:val="Compact"/>
+              <w:jc w:val="left"/>
+            </w:pPr>
+            <w:r>
+              <w:t xml:space="preserve">Correct</w:t>
+            </w:r>
+          </w:p>
+        </w:tc>
+        <w:tc>
+          <w:tcPr/>
+          <w:p>
+            <w:pPr>
+              <w:pStyle w:val="Compact"/>
+              <w:jc w:val="left"/>
+            </w:pPr>
+            <w:r>
+              <w:t xml:space="preserve">No call</w:t>
+            </w:r>
+          </w:p>
+        </w:tc>
+      </w:tr>
+      <w:tr>
+        <w:tc>
+          <w:tcPr/>
+          <w:p>
+            <w:pPr>
+              <w:pStyle w:val="Compact"/>
+              <w:jc w:val="left"/>
+            </w:pPr>
+            <w:r>
+              <w:t xml:space="preserve">sanger_refalign, 7 representative genomes, at least 99% identity</w:t>
+            </w:r>
+          </w:p>
+        </w:tc>
+        <w:tc>
+          <w:tcPr/>
+          <w:p>
+            <w:pPr>
+              <w:pStyle w:val="Compact"/>
+              <w:jc w:val="left"/>
+            </w:pPr>
+            <w:r>
+              <w:t xml:space="preserve">79</w:t>
+            </w:r>
+          </w:p>
+        </w:tc>
+        <w:tc>
+          <w:tcPr/>
+          <w:p>
+            <w:pPr>
+              <w:pStyle w:val="Compact"/>
+              <w:jc w:val="left"/>
+            </w:pPr>
+            <w:r>
+              <w:t xml:space="preserve">78</w:t>
+            </w:r>
+          </w:p>
+        </w:tc>
+        <w:tc>
+          <w:tcPr/>
+          <w:p>
+            <w:pPr>
+              <w:pStyle w:val="Compact"/>
+              <w:jc w:val="left"/>
+            </w:pPr>
+            <w:r>
+              <w:t xml:space="preserve">13</w:t>
+            </w:r>
+          </w:p>
+        </w:tc>
+      </w:tr>
+      <w:tr>
+        <w:tc>
+          <w:tcPr/>
+          <w:p>
+            <w:pPr>
+              <w:pStyle w:val="Compact"/>
+              <w:jc w:val="left"/>
+            </w:pPr>
+            <w:r>
+              <w:t xml:space="preserve">sanger_refalign, hsp65 amplicons of 72 genomes, at least 98% identity</w:t>
+            </w:r>
+          </w:p>
+        </w:tc>
+        <w:tc>
+          <w:tcPr/>
+          <w:p>
+            <w:pPr>
+              <w:pStyle w:val="Compact"/>
+              <w:jc w:val="left"/>
+            </w:pPr>
+            <w:r>
+              <w:t xml:space="preserve">83</w:t>
+            </w:r>
+          </w:p>
+        </w:tc>
+        <w:tc>
+          <w:tcPr/>
+          <w:p>
+            <w:pPr>
+              <w:pStyle w:val="Compact"/>
+              <w:jc w:val="left"/>
+            </w:pPr>
+            <w:r>
+              <w:t xml:space="preserve">82</w:t>
+            </w:r>
+          </w:p>
+        </w:tc>
+        <w:tc>
+          <w:tcPr/>
+          <w:p>
+            <w:pPr>
+              <w:pStyle w:val="Compact"/>
+              <w:jc w:val="left"/>
+            </w:pPr>
+            <w:r>
+              <w:t xml:space="preserve">9</w:t>
+            </w:r>
+          </w:p>
+        </w:tc>
+      </w:tr>
+      <w:tr>
+        <w:tc>
+          <w:tcPr/>
+          <w:p>
+            <w:pPr>
+              <w:pStyle w:val="Compact"/>
+              <w:jc w:val="left"/>
+            </w:pPr>
+            <w:r>
+              <w:t xml:space="preserve">sanger_mlsa (MLSA-style), nearest species</w:t>
+            </w:r>
+          </w:p>
+        </w:tc>
+        <w:tc>
+          <w:tcPr/>
+          <w:p>
+            <w:pPr>
+              <w:pStyle w:val="Compact"/>
+              <w:jc w:val="left"/>
+            </w:pPr>
+            <w:r>
+              <w:t xml:space="preserve">82</w:t>
+            </w:r>
+          </w:p>
+        </w:tc>
+        <w:tc>
+          <w:tcPr/>
+          <w:p>
+            <w:pPr>
+              <w:pStyle w:val="Compact"/>
+              <w:jc w:val="left"/>
+            </w:pPr>
+            <w:r>
+              <w:t xml:space="preserve">81</w:t>
+            </w:r>
+          </w:p>
+        </w:tc>
+        <w:tc>
+          <w:tcPr/>
+          <w:p>
+            <w:pPr>
+              <w:pStyle w:val="Compact"/>
+              <w:jc w:val="left"/>
+            </w:pPr>
+            <w:r>
+              <w:t xml:space="preserve">10</w:t>
+            </w:r>
+          </w:p>
+        </w:tc>
+      </w:tr>
+    </w:tbl>
     <w:p>
       <w:pPr>
         <w:pStyle w:val="Compact"/>
         <w:numPr>
           <w:ilvl w:val="0"/>
-          <w:numId w:val="1001"/>
+          <w:numId w:val="1002"/>
         </w:numPr>
       </w:pPr>
       <w:r>
-        <w:t xml:space="preserve">Picardeau M, et al. J Clin Microbiol 1997;35:25-32. doi:10.1128/jcm.35.1.25-32.1997</w:t>
+        <w:rPr>
+          <w:b/>
+          <w:bCs/>
+        </w:rPr>
+        <w:t xml:space="preserve">The choice of references hardly matters.</w:t>
+      </w:r>
+      <w:r>
+        <w:t xml:space="preserve"> </w:t>
+      </w:r>
+      <w:r>
+        <w:t xml:space="preserve">The 7 reference strains alone give the same result as all 72 genomes (83 ok, 82 correct). Adding one Korean genome to the 7 makes 2 persicum isolates ambiguous, because its amplicon lies within 1 difference of them; the 72-genome set is kept because it also flags the atypical lineage. The single error in each row was the mixed culture Mkan329-035.</w:t>
       </w:r>
     </w:p>
     <w:p>
@@ -1535,27 +2354,50 @@
         <w:pStyle w:val="Compact"/>
         <w:numPr>
           <w:ilvl w:val="0"/>
-          <w:numId w:val="1001"/>
+          <w:numId w:val="1002"/>
         </w:numPr>
       </w:pPr>
       <w:r>
-        <w:t xml:space="preserve">Richter E, et al. Identification of</w:t>
-      </w:r>
-      <w:r>
-        <w:t xml:space="preserve"> </w:t>
-      </w:r>
-      <w:r>
-        <w:rPr>
-          <w:i/>
-          <w:iCs/>
-        </w:rPr>
-        <w:t xml:space="preserve">Mycobacterium kansasii</w:t>
-      </w:r>
-      <w:r>
-        <w:t xml:space="preserve"> </w:t>
-      </w:r>
-      <w:r>
-        <w:t xml:space="preserve">by using a DNA probe (AccuProbe) and molecular techniques. J Clin Microbiol 1999;37:964-970. doi:10.1128/JCM.37.4.964-970.1999</w:t>
+        <w:rPr>
+          <w:b/>
+          <w:bCs/>
+        </w:rPr>
+        <w:t xml:space="preserve">The sanger_mlsa</w:t>
+      </w:r>
+      <w:r>
+        <w:rPr>
+          <w:b/>
+          <w:bCs/>
+        </w:rPr>
+        <w:t xml:space="preserve"> </w:t>
+      </w:r>
+      <w:r>
+        <w:rPr>
+          <w:rStyle w:val="VerbatimChar"/>
+          <w:b/>
+          <w:bCs/>
+        </w:rPr>
+        <w:t xml:space="preserve">unambiguous</w:t>
+      </w:r>
+      <w:r>
+        <w:rPr>
+          <w:b/>
+          <w:bCs/>
+        </w:rPr>
+        <w:t xml:space="preserve"> </w:t>
+      </w:r>
+      <w:r>
+        <w:rPr>
+          <w:b/>
+          <w:bCs/>
+        </w:rPr>
+        <w:t xml:space="preserve">flag is conservative by design.</w:t>
+      </w:r>
+      <w:r>
+        <w:t xml:space="preserve"> </w:t>
+      </w:r>
+      <w:r>
+        <w:t xml:space="preserve">It resolved only 8 of 127 isolates with hsp65 (3 of 42 with 16S added), because the three Korean genomes inflate kansasii’s within-species tolerance to 2.5%; without them, 110 of 110 were unambiguous. The nearest species was right in both runs (81 of 82). The flag measures what hsp65 cannot guarantee in the worst reference lineage, not performance on the isolates seen. Plain alignment (sanger_refalign) agreed with sanger_mlsa on all 78 shared calls.</w:t>
       </w:r>
     </w:p>
     <w:p>
@@ -1563,27 +2405,56 @@
         <w:pStyle w:val="Compact"/>
         <w:numPr>
           <w:ilvl w:val="0"/>
-          <w:numId w:val="1001"/>
+          <w:numId w:val="1002"/>
         </w:numPr>
       </w:pPr>
       <w:r>
-        <w:t xml:space="preserve">Tagini F, et al. Phylogenomics reveal that</w:t>
-      </w:r>
-      <w:r>
-        <w:t xml:space="preserve"> </w:t>
-      </w:r>
-      <w:r>
-        <w:rPr>
-          <w:i/>
-          <w:iCs/>
-        </w:rPr>
-        <w:t xml:space="preserve">Mycobacterium kansasii</w:t>
-      </w:r>
-      <w:r>
-        <w:t xml:space="preserve"> </w:t>
-      </w:r>
-      <w:r>
-        <w:t xml:space="preserve">subtypes are species-level lineages. Int J Syst Evol Microbiol 2019;69:1696-1704. doi:10.1099/ijsem.0.003378</w:t>
+        <w:t xml:space="preserve">None of the 252 hsp65 reads in the lab archive matched the Korean genomes.</w:t>
+      </w:r>
+    </w:p>
+    <w:bookmarkEnd w:id="37"/>
+    <w:bookmarkEnd w:id="38"/>
+    <w:bookmarkStart w:id="39" w:name="conclusion"/>
+    <w:p>
+      <w:pPr>
+        <w:pStyle w:val="Heading2"/>
+      </w:pPr>
+      <w:r>
+        <w:t xml:space="preserve">6. Conclusion</w:t>
+      </w:r>
+    </w:p>
+    <w:p>
+      <w:pPr>
+        <w:pStyle w:val="FirstParagraph"/>
+      </w:pPr>
+      <w:r>
+        <w:t xml:space="preserve">For the</w:t>
+      </w:r>
+      <w:r>
+        <w:t xml:space="preserve"> </w:t>
+      </w:r>
+      <w:r>
+        <w:rPr>
+          <w:i/>
+          <w:iCs/>
+        </w:rPr>
+        <w:t xml:space="preserve">M. kansasii</w:t>
+      </w:r>
+      <w:r>
+        <w:t xml:space="preserve"> </w:t>
+      </w:r>
+      <w:r>
+        <w:t xml:space="preserve">complex, a single good hsp65 Sanger read, aligned to one reference genome per species and called by best match with a margin, gave the genome species for all 109 isolates that produced a callable read and for all 174 perfect in-silico amplicons. The marker fails only through a defined atypical lineage, which did not occur among the 122 kansasii isolates of this cohort. The failures in practice were absent or contaminated reads, which the rules reject. Hsp65 sequencing is sufficient for routine species identification in this complex, with gyrA as the confirmation locus where the result must be certain.</w:t>
+      </w:r>
+    </w:p>
+    <w:bookmarkEnd w:id="39"/>
+    <w:bookmarkStart w:id="40" w:name="reproduction"/>
+    <w:p>
+      <w:pPr>
+        <w:pStyle w:val="Heading2"/>
+      </w:pPr>
+      <w:r>
+        <w:t xml:space="preserve">Reproduction</w:t>
       </w:r>
     </w:p>
     <w:p>
@@ -1591,16 +2462,368 @@
         <w:pStyle w:val="Compact"/>
         <w:numPr>
           <w:ilvl w:val="0"/>
-          <w:numId w:val="1001"/>
+          <w:numId w:val="1003"/>
         </w:numPr>
       </w:pPr>
       <w:r>
+        <w:t xml:space="preserve">This repo:</w:t>
+      </w:r>
+      <w:r>
+        <w:t xml:space="preserve"> </w:t>
+      </w:r>
+      <w:r>
+        <w:rPr>
+          <w:rStyle w:val="VerbatimChar"/>
+        </w:rPr>
+        <w:t xml:space="preserve">sbatch submit_validate.sbatch</w:t>
+      </w:r>
+      <w:r>
+        <w:t xml:space="preserve">,</w:t>
+      </w:r>
+      <w:r>
+        <w:t xml:space="preserve"> </w:t>
+      </w:r>
+      <w:r>
+        <w:rPr>
+          <w:rStyle w:val="VerbatimChar"/>
+        </w:rPr>
+        <w:t xml:space="preserve">python 02_blast_reads.py</w:t>
+      </w:r>
+      <w:r>
+        <w:t xml:space="preserve">,</w:t>
+      </w:r>
+      <w:r>
+        <w:t xml:space="preserve"> </w:t>
+      </w:r>
+      <w:r>
+        <w:rPr>
+          <w:rStyle w:val="VerbatimChar"/>
+        </w:rPr>
+        <w:t xml:space="preserve">python 03_figure.py</w:t>
+      </w:r>
+      <w:r>
+        <w:t xml:space="preserve">,</w:t>
+      </w:r>
+      <w:r>
+        <w:t xml:space="preserve"> </w:t>
+      </w:r>
+      <w:r>
+        <w:rPr>
+          <w:rStyle w:val="VerbatimChar"/>
+        </w:rPr>
+        <w:t xml:space="preserve">sbatch submit_korean_check.sbatch</w:t>
+      </w:r>
+      <w:r>
+        <w:t xml:space="preserve">; outputs in</w:t>
+      </w:r>
+      <w:r>
+        <w:t xml:space="preserve"> </w:t>
+      </w:r>
+      <w:r>
+        <w:rPr>
+          <w:rStyle w:val="VerbatimChar"/>
+        </w:rPr>
+        <w:t xml:space="preserve">output/hsp65_refalign/</w:t>
+      </w:r>
+      <w:r>
+        <w:t xml:space="preserve">.</w:t>
+      </w:r>
+    </w:p>
+    <w:p>
+      <w:pPr>
+        <w:pStyle w:val="Compact"/>
+        <w:numPr>
+          <w:ilvl w:val="0"/>
+          <w:numId w:val="1003"/>
+        </w:numPr>
+      </w:pPr>
+      <w:r>
+        <w:t xml:space="preserve">mlsa-kansasii:</w:t>
+      </w:r>
+      <w:r>
+        <w:t xml:space="preserve"> </w:t>
+      </w:r>
+      <w:r>
+        <w:rPr>
+          <w:rStyle w:val="VerbatimChar"/>
+        </w:rPr>
+        <w:t xml:space="preserve">locus_discovery*</w:t>
+      </w:r>
+      <w:r>
+        <w:t xml:space="preserve">,</w:t>
+      </w:r>
+      <w:r>
+        <w:t xml:space="preserve"> </w:t>
+      </w:r>
+      <w:r>
+        <w:rPr>
+          <w:rStyle w:val="VerbatimChar"/>
+        </w:rPr>
+        <w:t xml:space="preserve">sanger_refalign/submit_hsp65_amplicon_alignment.sbatch</w:t>
+      </w:r>
+      <w:r>
+        <w:t xml:space="preserve"> </w:t>
+      </w:r>
+      <w:r>
+        <w:t xml:space="preserve">(references from</w:t>
+      </w:r>
+      <w:r>
+        <w:t xml:space="preserve"> </w:t>
+      </w:r>
+      <w:r>
+        <w:rPr>
+          <w:rStyle w:val="VerbatimChar"/>
+        </w:rPr>
+        <w:t xml:space="preserve">scripts/04_make_hsp65_references.py</w:t>
+      </w:r>
+      <w:r>
+        <w:t xml:space="preserve">),</w:t>
+      </w:r>
+      <w:r>
+        <w:t xml:space="preserve"> </w:t>
+      </w:r>
+      <w:r>
+        <w:rPr>
+          <w:rStyle w:val="VerbatimChar"/>
+        </w:rPr>
+        <w:t xml:space="preserve">sanger_vs_wgs/</w:t>
+      </w:r>
+      <w:r>
+        <w:t xml:space="preserve">; outputs in</w:t>
+      </w:r>
+      <w:r>
+        <w:t xml:space="preserve"> </w:t>
+      </w:r>
+      <w:r>
+        <w:rPr>
+          <w:rStyle w:val="VerbatimChar"/>
+        </w:rPr>
+        <w:t xml:space="preserve">output/mlsa/</w:t>
+      </w:r>
+      <w:r>
+        <w:t xml:space="preserve">.</w:t>
+      </w:r>
+    </w:p>
+    <w:p>
+      <w:pPr>
+        <w:pStyle w:val="Compact"/>
+        <w:numPr>
+          <w:ilvl w:val="0"/>
+          <w:numId w:val="1003"/>
+        </w:numPr>
+      </w:pPr>
+      <w:r>
+        <w:t xml:space="preserve">sanger-microsynth:</w:t>
+      </w:r>
+      <w:r>
+        <w:t xml:space="preserve"> </w:t>
+      </w:r>
+      <w:r>
+        <w:rPr>
+          <w:rStyle w:val="VerbatimChar"/>
+        </w:rPr>
+        <w:t xml:space="preserve">sanger_ms/call.py</w:t>
+      </w:r>
+      <w:r>
+        <w:t xml:space="preserve">,</w:t>
+      </w:r>
+      <w:r>
+        <w:t xml:space="preserve"> </w:t>
+      </w:r>
+      <w:r>
+        <w:rPr>
+          <w:rStyle w:val="VerbatimChar"/>
+        </w:rPr>
+        <w:t xml:space="preserve">main2_analyse_report/run_analyse_report.py</w:t>
+      </w:r>
+      <w:r>
+        <w:t xml:space="preserve">.</w:t>
+      </w:r>
+    </w:p>
+    <w:p>
+      <w:pPr>
+        <w:pStyle w:val="Compact"/>
+        <w:numPr>
+          <w:ilvl w:val="0"/>
+          <w:numId w:val="1003"/>
+        </w:numPr>
+      </w:pPr>
+      <w:r>
+        <w:t xml:space="preserve">Run order and provenance:</w:t>
+      </w:r>
+      <w:r>
+        <w:t xml:space="preserve"> </w:t>
+      </w:r>
+      <w:r>
+        <w:rPr>
+          <w:rStyle w:val="VerbatimChar"/>
+        </w:rPr>
+        <w:t xml:space="preserve">kansasii-docs/README.md</w:t>
+      </w:r>
+      <w:r>
+        <w:t xml:space="preserve">.</w:t>
+      </w:r>
+    </w:p>
+    <w:bookmarkEnd w:id="40"/>
+    <w:bookmarkStart w:id="41" w:name="references"/>
+    <w:p>
+      <w:pPr>
+        <w:pStyle w:val="Heading2"/>
+      </w:pPr>
+      <w:r>
+        <w:t xml:space="preserve">References</w:t>
+      </w:r>
+    </w:p>
+    <w:p>
+      <w:pPr>
+        <w:pStyle w:val="Compact"/>
+        <w:numPr>
+          <w:ilvl w:val="0"/>
+          <w:numId w:val="1004"/>
+        </w:numPr>
+      </w:pPr>
+      <w:r>
+        <w:t xml:space="preserve">Alcaide F, et al. J Clin Microbiol 1997;35:1959-1964. doi:10.1128/jcm.35.8.1959-1964.1997</w:t>
+      </w:r>
+    </w:p>
+    <w:p>
+      <w:pPr>
+        <w:pStyle w:val="Compact"/>
+        <w:numPr>
+          <w:ilvl w:val="0"/>
+          <w:numId w:val="1004"/>
+        </w:numPr>
+      </w:pPr>
+      <w:r>
+        <w:t xml:space="preserve">Jagielski T, et al. Genomic insights into the</w:t>
+      </w:r>
+      <w:r>
+        <w:t xml:space="preserve"> </w:t>
+      </w:r>
+      <w:r>
+        <w:rPr>
+          <w:i/>
+          <w:iCs/>
+        </w:rPr>
+        <w:t xml:space="preserve">Mycobacterium kansasii</w:t>
+      </w:r>
+      <w:r>
+        <w:t xml:space="preserve"> </w:t>
+      </w:r>
+      <w:r>
+        <w:t xml:space="preserve">complex: an update. Front Microbiol 2019;10:2918. doi:10.3389/fmicb.2019.02918</w:t>
+      </w:r>
+    </w:p>
+    <w:p>
+      <w:pPr>
+        <w:pStyle w:val="Compact"/>
+        <w:numPr>
+          <w:ilvl w:val="0"/>
+          <w:numId w:val="1004"/>
+        </w:numPr>
+      </w:pPr>
+      <w:r>
+        <w:t xml:space="preserve">Kim H, et al. Int J Syst Evol Microbiol 2005;55:1649-1656. doi:10.1099/ijs.0.63553-0</w:t>
+      </w:r>
+    </w:p>
+    <w:p>
+      <w:pPr>
+        <w:pStyle w:val="Compact"/>
+        <w:numPr>
+          <w:ilvl w:val="0"/>
+          <w:numId w:val="1004"/>
+        </w:numPr>
+      </w:pPr>
+      <w:r>
+        <w:t xml:space="preserve">McNabb A, et al. J Clin Microbiol 2004;42:3000-3011. doi:10.1128/JCM.42.7.3000-3011.2004</w:t>
+      </w:r>
+    </w:p>
+    <w:p>
+      <w:pPr>
+        <w:pStyle w:val="Compact"/>
+        <w:numPr>
+          <w:ilvl w:val="0"/>
+          <w:numId w:val="1004"/>
+        </w:numPr>
+      </w:pPr>
+      <w:r>
+        <w:t xml:space="preserve">Picardeau M, et al. J Clin Microbiol 1997;35:25-32. doi:10.1128/jcm.35.1.25-32.1997</w:t>
+      </w:r>
+    </w:p>
+    <w:p>
+      <w:pPr>
+        <w:pStyle w:val="Compact"/>
+        <w:numPr>
+          <w:ilvl w:val="0"/>
+          <w:numId w:val="1004"/>
+        </w:numPr>
+      </w:pPr>
+      <w:r>
+        <w:t xml:space="preserve">Richter E, et al. Identification of</w:t>
+      </w:r>
+      <w:r>
+        <w:t xml:space="preserve"> </w:t>
+      </w:r>
+      <w:r>
+        <w:rPr>
+          <w:i/>
+          <w:iCs/>
+        </w:rPr>
+        <w:t xml:space="preserve">Mycobacterium kansasii</w:t>
+      </w:r>
+      <w:r>
+        <w:t xml:space="preserve"> </w:t>
+      </w:r>
+      <w:r>
+        <w:t xml:space="preserve">by using a DNA probe (AccuProbe) and molecular techniques. J Clin Microbiol 1999;37:964-970. doi:10.1128/JCM.37.4.964-970.1999</w:t>
+      </w:r>
+    </w:p>
+    <w:p>
+      <w:pPr>
+        <w:pStyle w:val="Compact"/>
+        <w:numPr>
+          <w:ilvl w:val="0"/>
+          <w:numId w:val="1004"/>
+        </w:numPr>
+      </w:pPr>
+      <w:r>
+        <w:t xml:space="preserve">Tagini F, et al. Phylogenomics reveal that</w:t>
+      </w:r>
+      <w:r>
+        <w:t xml:space="preserve"> </w:t>
+      </w:r>
+      <w:r>
+        <w:rPr>
+          <w:i/>
+          <w:iCs/>
+        </w:rPr>
+        <w:t xml:space="preserve">Mycobacterium kansasii</w:t>
+      </w:r>
+      <w:r>
+        <w:t xml:space="preserve"> </w:t>
+      </w:r>
+      <w:r>
+        <w:t xml:space="preserve">subtypes are species-level lineages. Int J Syst Evol Microbiol 2019;69:1696-1704. doi:10.1099/ijsem.0.003378</w:t>
+      </w:r>
+    </w:p>
+    <w:p>
+      <w:pPr>
+        <w:pStyle w:val="Compact"/>
+        <w:numPr>
+          <w:ilvl w:val="0"/>
+          <w:numId w:val="1004"/>
+        </w:numPr>
+      </w:pPr>
+      <w:r>
         <w:t xml:space="preserve">Telenti A, et al. Rapid identification of mycobacteria to the species level by PCR and restriction enzyme analysis. J Clin Microbiol 1993;31:175-178. doi:10.1128/jcm.31.2.175-178.1993</w:t>
       </w:r>
     </w:p>
-    <w:bookmarkEnd w:id="33"/>
-    <w:bookmarkEnd w:id="34"/>
-    <w:sectPr/>
+    <w:bookmarkEnd w:id="41"/>
+    <w:bookmarkEnd w:id="42"/>
+    <w:sectPr>
+      <w:pgSz w:w="12240" w:h="15840"/>
+      <w:pgMar w:top="1080" w:right="1080" w:bottom="1080" w:left="1080" w:header="708" w:footer="708" w:gutter="0"/>
+    </w:sectPr>
   </w:body>
 </w:document>
 </file>
@@ -1706,6 +2929,91 @@
       </w:pPr>
     </w:lvl>
   </w:abstractNum>
+  <w:abstractNum w:abstractNumId="99411">
+    <w:nsid w:val="00A99411"/>
+    <w:multiLevelType w:val="multilevel"/>
+    <w:lvl w:ilvl="0">
+      <w:start w:val="1"/>
+      <w:numFmt w:val="decimal"/>
+      <w:lvlText w:val="%1."/>
+      <w:lvlJc w:val="left"/>
+      <w:pPr>
+        <w:ind w:left="720" w:hanging="480"/>
+      </w:pPr>
+    </w:lvl>
+    <w:lvl w:ilvl="1">
+      <w:start w:val="1"/>
+      <w:numFmt w:val="decimal"/>
+      <w:lvlText w:val="%2."/>
+      <w:lvlJc w:val="left"/>
+      <w:pPr>
+        <w:ind w:left="1440" w:hanging="480"/>
+      </w:pPr>
+    </w:lvl>
+    <w:lvl w:ilvl="2">
+      <w:start w:val="1"/>
+      <w:numFmt w:val="decimal"/>
+      <w:lvlText w:val="%3."/>
+      <w:lvlJc w:val="left"/>
+      <w:pPr>
+        <w:ind w:left="2160" w:hanging="480"/>
+      </w:pPr>
+    </w:lvl>
+    <w:lvl w:ilvl="3">
+      <w:start w:val="1"/>
+      <w:numFmt w:val="decimal"/>
+      <w:lvlText w:val="%4."/>
+      <w:lvlJc w:val="left"/>
+      <w:pPr>
+        <w:ind w:left="2880" w:hanging="480"/>
+      </w:pPr>
+    </w:lvl>
+    <w:lvl w:ilvl="4">
+      <w:start w:val="1"/>
+      <w:numFmt w:val="decimal"/>
+      <w:lvlText w:val="%5."/>
+      <w:lvlJc w:val="left"/>
+      <w:pPr>
+        <w:ind w:left="3600" w:hanging="480"/>
+      </w:pPr>
+    </w:lvl>
+    <w:lvl w:ilvl="5">
+      <w:start w:val="1"/>
+      <w:numFmt w:val="decimal"/>
+      <w:lvlText w:val="%6."/>
+      <w:lvlJc w:val="left"/>
+      <w:pPr>
+        <w:ind w:left="4320" w:hanging="480"/>
+      </w:pPr>
+    </w:lvl>
+    <w:lvl w:ilvl="6">
+      <w:start w:val="1"/>
+      <w:numFmt w:val="decimal"/>
+      <w:lvlText w:val="%7."/>
+      <w:lvlJc w:val="left"/>
+      <w:pPr>
+        <w:ind w:left="5040" w:hanging="480"/>
+      </w:pPr>
+    </w:lvl>
+    <w:lvl w:ilvl="7">
+      <w:start w:val="1"/>
+      <w:numFmt w:val="decimal"/>
+      <w:lvlText w:val="%8."/>
+      <w:lvlJc w:val="left"/>
+      <w:pPr>
+        <w:ind w:left="5760" w:hanging="480"/>
+      </w:pPr>
+    </w:lvl>
+    <w:lvl w:ilvl="8">
+      <w:start w:val="1"/>
+      <w:numFmt w:val="decimal"/>
+      <w:lvlText w:val="%9."/>
+      <w:lvlJc w:val="left"/>
+      <w:pPr>
+        <w:ind w:left="6480" w:hanging="480"/>
+      </w:pPr>
+    </w:lvl>
+  </w:abstractNum>
   <w:abstractNum w:abstractNumId="991">
     <w:nsid w:val="0000A991"/>
     <w:multiLevelType w:val="multilevel"/>
@@ -1786,6 +3094,42 @@
     <w:abstractNumId w:val="990"/>
   </w:num>
   <w:num w:numId="1001">
+    <w:abstractNumId w:val="99411"/>
+    <w:lvlOverride w:ilvl="0">
+      <w:startOverride w:val="1"/>
+    </w:lvlOverride>
+    <w:lvlOverride w:ilvl="1">
+      <w:startOverride w:val="1"/>
+    </w:lvlOverride>
+    <w:lvlOverride w:ilvl="2">
+      <w:startOverride w:val="1"/>
+    </w:lvlOverride>
+    <w:lvlOverride w:ilvl="3">
+      <w:startOverride w:val="1"/>
+    </w:lvlOverride>
+    <w:lvlOverride w:ilvl="4">
+      <w:startOverride w:val="1"/>
+    </w:lvlOverride>
+    <w:lvlOverride w:ilvl="5">
+      <w:startOverride w:val="1"/>
+    </w:lvlOverride>
+    <w:lvlOverride w:ilvl="6">
+      <w:startOverride w:val="1"/>
+    </w:lvlOverride>
+    <w:lvlOverride w:ilvl="7">
+      <w:startOverride w:val="1"/>
+    </w:lvlOverride>
+    <w:lvlOverride w:ilvl="8">
+      <w:startOverride w:val="1"/>
+    </w:lvlOverride>
+  </w:num>
+  <w:num w:numId="1002">
+    <w:abstractNumId w:val="991"/>
+  </w:num>
+  <w:num w:numId="1003">
+    <w:abstractNumId w:val="991"/>
+  </w:num>
+  <w:num w:numId="1004">
     <w:abstractNumId w:val="991"/>
   </w:num>
 </w:numbering>

</xml_diff>